<commit_message>
chore: added data fields
</commit_message>
<xml_diff>
--- a/media/docs/079BCT033_Bini Chand.docx
+++ b/media/docs/079BCT033_Bini Chand.docx
@@ -38,8 +38,8 @@
         <w:autoSpaceDE w:val="0"/>
         <w:widowControl/>
         <w:spacing w:line="328" w:lineRule="exact" w:before="374" w:after="0"/>
-        <w:ind w:left="0" w:right="0" w:firstLine="0"/>
-        <w:jc w:val="center"/>
+        <w:ind w:left="34" w:right="34" w:firstLine="0"/>
+        <w:jc w:val="both"/>
       </w:pPr>
       <w:r>
         <w:rPr>
@@ -59,18 +59,8 @@
           <w:color w:val="000000"/>
           <w:sz w:val="22"/>
         </w:rPr>
-        <w:t>I have known Bini for about 2 years now as an undergraduate student in BCT Engineering.</w:t>
+        <w:t xml:space="preserve">I have known Bini for about 3 years now as an undergraduate student in BCT Engineering. </w:t>
       </w:r>
-    </w:p>
-    <w:p>
-      <w:pPr>
-        <w:autoSpaceDN w:val="0"/>
-        <w:autoSpaceDE w:val="0"/>
-        <w:widowControl/>
-        <w:spacing w:line="302" w:lineRule="exact" w:before="26" w:after="0"/>
-        <w:ind w:left="34" w:right="0" w:firstLine="0"/>
-        <w:jc w:val="left"/>
-      </w:pPr>
       <w:r>
         <w:rPr>
           <w:rFonts w:ascii="Helvetica" w:hAnsi="Helvetica" w:eastAsia="Helvetica"/>
@@ -79,7 +69,17 @@
           <w:color w:val="000000"/>
           <w:sz w:val="22"/>
         </w:rPr>
-        <w:t>Moreover, I was the supervisor for her final year project. I taught her Data Communication.</w:t>
+        <w:t xml:space="preserve">Moreover, I was the supervisor for her final year project. I taught her Computer Graphics, and </w:t>
+      </w:r>
+      <w:r>
+        <w:rPr>
+          <w:rFonts w:ascii="Helvetica" w:hAnsi="Helvetica" w:eastAsia="Helvetica"/>
+          <w:b w:val="0"/>
+          <w:i w:val="0"/>
+          <w:color w:val="000000"/>
+          <w:sz w:val="22"/>
+        </w:rPr>
+        <w:t>Data Communication.</w:t>
       </w:r>
     </w:p>
     <w:p>
@@ -87,7 +87,7 @@
         <w:autoSpaceDN w:val="0"/>
         <w:autoSpaceDE w:val="0"/>
         <w:widowControl/>
-        <w:spacing w:line="328" w:lineRule="exact" w:before="326" w:after="0"/>
+        <w:spacing w:line="328" w:lineRule="exact" w:before="328" w:after="0"/>
         <w:ind w:left="34" w:right="34" w:firstLine="0"/>
         <w:jc w:val="both"/>
       </w:pPr>
@@ -109,7 +109,7 @@
           <w:color w:val="000000"/>
           <w:sz w:val="22"/>
         </w:rPr>
-        <w:t xml:space="preserve">performance throughout her undergraduate ranking among the Top 5% students of her batch. </w:t>
+        <w:t xml:space="preserve">performance throughout her undergraduate ranking among the Top 20% students of her batch. </w:t>
       </w:r>
       <w:r>
         <w:rPr>
@@ -137,7 +137,7 @@
         <w:autoSpaceDN w:val="0"/>
         <w:autoSpaceDE w:val="0"/>
         <w:widowControl/>
-        <w:spacing w:line="328" w:lineRule="exact" w:before="328" w:after="0"/>
+        <w:spacing w:line="328" w:lineRule="exact" w:before="326" w:after="0"/>
         <w:ind w:left="34" w:right="34" w:firstLine="0"/>
         <w:jc w:val="both"/>
       </w:pPr>
@@ -179,7 +179,7 @@
           <w:color w:val="000000"/>
           <w:sz w:val="22"/>
         </w:rPr>
-        <w:t>was also able to publish a paper on ml.</w:t>
+        <w:t>was also able to publish a paper on Ai adoption process.</w:t>
       </w:r>
     </w:p>
     <w:p>
@@ -187,7 +187,7 @@
         <w:autoSpaceDN w:val="0"/>
         <w:autoSpaceDE w:val="0"/>
         <w:widowControl/>
-        <w:spacing w:line="328" w:lineRule="exact" w:before="326" w:after="0"/>
+        <w:spacing w:line="328" w:lineRule="exact" w:before="328" w:after="0"/>
         <w:ind w:left="34" w:right="34" w:firstLine="0"/>
         <w:jc w:val="both"/>
       </w:pPr>
@@ -199,7 +199,7 @@
           <w:color w:val="000000"/>
           <w:sz w:val="22"/>
         </w:rPr>
-        <w:t xml:space="preserve">I have noted her outstanding presentation skills while she presented her work at our </w:t>
+        <w:t xml:space="preserve">I have noted her excellent presentation skills while she presented her work at our department </w:t>
       </w:r>
       <w:r>
         <w:rPr>
@@ -209,7 +209,7 @@
           <w:color w:val="000000"/>
           <w:sz w:val="22"/>
         </w:rPr>
-        <w:t xml:space="preserve">department as well as in the conference. I have seen that she has good leadership capability </w:t>
+        <w:t xml:space="preserve">as well as in the conference. I have seen that she has good leadership capability and has a </w:t>
       </w:r>
       <w:r>
         <w:rPr>
@@ -219,7 +219,7 @@
           <w:color w:val="000000"/>
           <w:sz w:val="22"/>
         </w:rPr>
-        <w:t xml:space="preserve">and has a teamwork spirit. She is a very hardworking student who is always eager to learn. </w:t>
+        <w:t xml:space="preserve">teamwork spirit. She is very helpful and cooperative student. She eagerly handed over her </w:t>
       </w:r>
       <w:r>
         <w:rPr>
@@ -229,7 +229,7 @@
           <w:color w:val="000000"/>
           <w:sz w:val="22"/>
         </w:rPr>
-        <w:t xml:space="preserve">She is a well-spoken person with a friendly and gentle personality. She also has given his time </w:t>
+        <w:t xml:space="preserve">project work to her juniors who wanted to further continue the research on the topic along with </w:t>
       </w:r>
       <w:r>
         <w:rPr>
@@ -239,7 +239,7 @@
           <w:color w:val="000000"/>
           <w:sz w:val="22"/>
         </w:rPr>
-        <w:t xml:space="preserve">to different social causes. She is very helpful and cooperative student. She eagerly handed </w:t>
+        <w:t xml:space="preserve">proper guidance and resources. I have also been impressed by her communication skills during </w:t>
       </w:r>
       <w:r>
         <w:rPr>
@@ -249,27 +249,7 @@
           <w:color w:val="000000"/>
           <w:sz w:val="22"/>
         </w:rPr>
-        <w:t xml:space="preserve">over her project work to her juniors who wanted to further continue the research on the topic </w:t>
-      </w:r>
-      <w:r>
-        <w:rPr>
-          <w:rFonts w:ascii="Helvetica" w:hAnsi="Helvetica" w:eastAsia="Helvetica"/>
-          <w:b w:val="0"/>
-          <w:i w:val="0"/>
-          <w:color w:val="000000"/>
-          <w:sz w:val="22"/>
-        </w:rPr>
-        <w:t xml:space="preserve">along with proper guidance and resources. I have also been impressed by her communication </w:t>
-      </w:r>
-      <w:r>
-        <w:rPr>
-          <w:rFonts w:ascii="Helvetica" w:hAnsi="Helvetica" w:eastAsia="Helvetica"/>
-          <w:b w:val="0"/>
-          <w:i w:val="0"/>
-          <w:color w:val="000000"/>
-          <w:sz w:val="22"/>
-        </w:rPr>
-        <w:t>skills during project presentations and lectures.</w:t>
+        <w:t>project presentations and lectures.</w:t>
       </w:r>
     </w:p>
     <w:p>
@@ -277,7 +257,7 @@
         <w:autoSpaceDN w:val="0"/>
         <w:autoSpaceDE w:val="0"/>
         <w:widowControl/>
-        <w:spacing w:line="328" w:lineRule="exact" w:before="326" w:after="0"/>
+        <w:spacing w:line="328" w:lineRule="exact" w:before="328" w:after="0"/>
         <w:ind w:left="34" w:right="34" w:firstLine="0"/>
         <w:jc w:val="both"/>
       </w:pPr>
@@ -319,7 +299,27 @@
           <w:color w:val="000000"/>
           <w:sz w:val="22"/>
         </w:rPr>
-        <w:t>deployed her project publicly in our server and maintained it.</w:t>
+        <w:t xml:space="preserve">deployed her project publicly in our server and maintained it. She has worked in some IT </w:t>
+      </w:r>
+      <w:r>
+        <w:rPr>
+          <w:rFonts w:ascii="Helvetica" w:hAnsi="Helvetica" w:eastAsia="Helvetica"/>
+          <w:b w:val="0"/>
+          <w:i w:val="0"/>
+          <w:color w:val="000000"/>
+          <w:sz w:val="22"/>
+        </w:rPr>
+        <w:t xml:space="preserve">companies which, I believe, has further added to her technical skills and professional </w:t>
+      </w:r>
+      <w:r>
+        <w:rPr>
+          <w:rFonts w:ascii="Helvetica" w:hAnsi="Helvetica" w:eastAsia="Helvetica"/>
+          <w:b w:val="0"/>
+          <w:i w:val="0"/>
+          <w:color w:val="000000"/>
+          <w:sz w:val="22"/>
+        </w:rPr>
+        <w:t>experience.</w:t>
       </w:r>
     </w:p>
     <w:p>
@@ -327,7 +327,7 @@
         <w:autoSpaceDN w:val="0"/>
         <w:autoSpaceDE w:val="0"/>
         <w:widowControl/>
-        <w:spacing w:line="328" w:lineRule="exact" w:before="326" w:after="0"/>
+        <w:spacing w:line="328" w:lineRule="exact" w:before="328" w:after="0"/>
         <w:ind w:left="34" w:right="34" w:firstLine="0"/>
         <w:jc w:val="both"/>
       </w:pPr>
@@ -367,7 +367,7 @@
         <w:autoSpaceDN w:val="0"/>
         <w:autoSpaceDE w:val="0"/>
         <w:widowControl/>
-        <w:spacing w:line="328" w:lineRule="exact" w:before="328" w:after="0"/>
+        <w:spacing w:line="328" w:lineRule="exact" w:before="326" w:after="0"/>
         <w:ind w:left="34" w:right="2880" w:firstLine="0"/>
         <w:jc w:val="left"/>
       </w:pPr>
@@ -428,7 +428,7 @@
           <w:color w:val="000000"/>
           <w:sz w:val="22"/>
         </w:rPr>
-        <w:t xml:space="preserve">Phone: 9848867782 </w:t>
+        <w:t xml:space="preserve">Phone: None </w:t>
       </w:r>
       <w:r>
         <w:br/>
@@ -441,12 +441,12 @@
           <w:color w:val="000000"/>
           <w:sz w:val="22"/>
         </w:rPr>
-        <w:t>Mail: 079bct033.bini@pcampus.edu.np</w:t>
+        <w:t>Mail: Beanie@gmail.com</w:t>
       </w:r>
     </w:p>
     <w:sectPr>
       <w:pgSz w:w="12240" w:h="15840"/>
-      <w:pgMar w:top="324" w:right="1440" w:bottom="1008" w:left="1440" w:header="720" w:footer="720" w:gutter="0"/>
+      <w:pgMar w:top="324" w:right="1440" w:bottom="842" w:left="1440" w:header="720" w:footer="720" w:gutter="0"/>
       <w:cols/>
       <w:docGrid w:linePitch="360"/>
     </w:sectPr>

</xml_diff>